<commit_message>
Update resume to Jeyamani_M_FullStack_Resume.pdf and add Spam Detector project with dashboard preview image
</commit_message>
<xml_diff>
--- a/Jeyamani_M_FullStack_Resume.docx
+++ b/Jeyamani_M_FullStack_Resume.docx
@@ -238,7 +238,7 @@
             <w:pPr>
               <w:spacing w:after="70" w:before="260" w:line="370"/>
             </w:pPr>
-            <w:hyperlink w:history="1" r:id="rIdmraxtkk52jwh5godlkhr6">
+            <w:hyperlink w:history="1" r:id="rIdr5so8eytkjoarddvnnlok">
               <w:r>
                 <w:rPr>
                   <w:b/>
@@ -269,7 +269,7 @@
             <w:pPr>
               <w:spacing w:after="70" w:before="260" w:line="370"/>
             </w:pPr>
-            <w:hyperlink w:history="1" r:id="rIdnhqxff-40vlrfm4gs7tcn">
+            <w:hyperlink w:history="1" r:id="rIdfqcyqwbmvltgjubezexpg">
               <w:r>
                 <w:rPr>
                   <w:b/>
@@ -300,7 +300,7 @@
             <w:pPr>
               <w:spacing w:after="70" w:before="260" w:line="370"/>
             </w:pPr>
-            <w:hyperlink w:history="1" r:id="rIdmfjz_06pxgnrlc_uxy-gg">
+            <w:hyperlink w:history="1" r:id="rIdobhetj_gujjvoyz0pfjwc">
               <w:r>
                 <w:rPr>
                   <w:b/>
@@ -310,7 +310,7 @@
                   <w:szCs w:val="22"/>
                   <w:u w:val="single"/>
                 </w:rPr>
-                <w:t xml:space="preserve">Movie Review</w:t>
+                <w:t xml:space="preserve">Spam Detector</w:t>
               </w:r>
             </w:hyperlink>
           </w:p>
@@ -324,7 +324,7 @@
                 <w:sz w:val="20"/>
                 <w:szCs w:val="20"/>
               </w:rPr>
-              <w:t xml:space="preserve">Built a movie browsing application displaying trailers, ratings, and categorized movie listings. Integrated an external movie API using JavaScript fetch to pull real-time movie data with a netflix-style browser.</w:t>
+              <w:t xml:space="preserve">Built a machine learning-based spam detection app that classifies messages as spam or legitimate in real time. Preprocessed text using NLP techniques (tokenization, stopword removal, TF-IDF vectorization) and trained a classification model with Scikit-learn, wrapped in a simple web interface for instant predictions.</w:t>
             </w:r>
           </w:p>
         </w:tc>
@@ -751,7 +751,7 @@
                   <w:pPr>
                     <w:spacing w:after="0"/>
                   </w:pPr>
-                  <w:hyperlink w:history="1" r:id="rIdsxsxitbo7f5lv8gqkdiyk">
+                  <w:hyperlink w:history="1" r:id="rIdl3tpqhijdkco3pd55vkxb">
                     <w:r>
                       <w:rPr>
                         <w:color w:val="1155CC"/>
@@ -873,7 +873,7 @@
                   <w:pPr>
                     <w:spacing w:after="0"/>
                   </w:pPr>
-                  <w:hyperlink w:history="1" r:id="rIdrmen6bz55w6j91mw1ijly">
+                  <w:hyperlink w:history="1" r:id="rIdfj5zfndf_qoqk8tjxtxwc">
                     <w:r>
                       <w:rPr>
                         <w:color w:val="1155CC"/>
@@ -995,7 +995,7 @@
                   <w:pPr>
                     <w:spacing w:after="0"/>
                   </w:pPr>
-                  <w:hyperlink w:history="1" r:id="rId-amazpdk1vsotdkj0u1nw">
+                  <w:hyperlink w:history="1" r:id="rId9hjn1qwobxe8z1bmjq3yr">
                     <w:r>
                       <w:rPr>
                         <w:color w:val="1155CC"/>

</xml_diff>